<commit_message>
change to Gotenberg for PDF Preview
</commit_message>
<xml_diff>
--- a/SistemBeritaAcara.Web/wwwroot/files/templates/Template_BA_LAINNYA.docx
+++ b/SistemBeritaAcara.Web/wwwroot/files/templates/Template_BA_LAINNYA.docx
@@ -11,7 +11,7 @@
         <w:rPr>
           <w:rFonts w:ascii="Arial" w:hAnsi="Arial"/>
           <w:b/>
-          <w:sz w:val="48"/>
+          <w:sz w:val="24"/>
         </w:rPr>
         <w:t>BERITA ACARA</w:t>
       </w:r>
@@ -25,7 +25,7 @@
         <w:rPr>
           <w:rFonts w:ascii="Arial" w:hAnsi="Arial"/>
           <w:b/>
-          <w:sz w:val="40"/>
+          <w:sz w:val="24"/>
         </w:rPr>
         <w:t>BERITA ACARA ALOKASI BARANG</w:t>
       </w:r>
@@ -37,7 +37,7 @@
       <w:r>
         <w:rPr>
           <w:rFonts w:ascii="Arial" w:hAnsi="Arial"/>
-          <w:sz w:val="28"/>
+          <w:sz w:val="24"/>
         </w:rPr>
         <w:t>{{NomorSurat}}</w:t>
       </w:r>

</xml_diff>

<commit_message>
fix ba lainnya layout
</commit_message>
<xml_diff>
--- a/SistemBeritaAcara.Web/wwwroot/files/templates/Template_BA_LAINNYA.docx
+++ b/SistemBeritaAcara.Web/wwwroot/files/templates/Template_BA_LAINNYA.docx
@@ -55,30 +55,12 @@
           <w:sz w:val="20"/>
           <w:szCs w:val="20"/>
         </w:rPr>
-        <w:t>{{</w:t>
-      </w:r>
-      <w:proofErr w:type="spellStart"/>
-      <w:r>
-        <w:rPr>
-          <w:rFonts w:ascii="Arial" w:hAnsi="Arial"/>
-          <w:sz w:val="20"/>
-          <w:szCs w:val="20"/>
-        </w:rPr>
-        <w:t>NomorSurat</w:t>
-      </w:r>
-      <w:proofErr w:type="spellEnd"/>
-      <w:r>
-        <w:rPr>
-          <w:rFonts w:ascii="Arial" w:hAnsi="Arial"/>
-          <w:sz w:val="20"/>
-          <w:szCs w:val="20"/>
-        </w:rPr>
-        <w:t>}}</w:t>
+        <w:t>{{NomorSurat}}</w:t>
       </w:r>
     </w:p>
     <w:sectPr>
       <w:pgSz w:w="11906" w:h="16838" w:code="9"/>
-      <w:pgMar w:top="1138" w:right="1138" w:bottom="1138" w:left="1138" w:header="720" w:footer="720" w:gutter="0"/>
+      <w:pgMar w:top="1134" w:right="1134" w:bottom="1134" w:left="1134" w:header="720" w:footer="720" w:gutter="0"/>
       <w:cols w:space="720"/>
       <w:docGrid w:linePitch="360"/>
     </w:sectPr>
@@ -91,7 +73,7 @@
   <w:docDefaults>
     <w:rPrDefault>
       <w:rPr>
-        <w:rFonts w:asciiTheme="minorHAnsi" w:eastAsiaTheme="minorEastAsia" w:hAnsiTheme="minorHAnsi" w:cstheme="minorBidi"/>
+        <w:rFonts w:asciiTheme="minorHAnsi" w:eastAsiaTheme="minorHAnsi" w:hAnsiTheme="minorHAnsi" w:cstheme="minorBidi"/>
         <w:kern w:val="2"/>
         <w:sz w:val="24"/>
         <w:szCs w:val="24"/>

</xml_diff>